<commit_message>
Removed excessive footnotes from table 3
</commit_message>
<xml_diff>
--- a/tables/table3.docx
+++ b/tables/table3.docx
@@ -52,16 +52,6 @@
         </w:rPr>
         <w:t xml:space="preserve">Table 3: I-Scores For Post-World War II American Minor Party Candidates</w:t>
       </w:r>
-      <w:r>
-        <w:rPr>
-          <w:vertAlign w:val="superscript"/>
-          <w:i/>
-          <w:rFonts w:ascii="Calibri" w:hAnsi="Calibri"/>
-          <w:sz w:val="24"/>
-          <w:color w:val="333333"/>
-        </w:rPr>
-        <w:t xml:space="default">a,b</w:t>
-      </w:r>
     </w:p>
     <w:tbl xmlns:w="http://schemas.openxmlformats.org/wordprocessingml/2006/main" xmlns:wp="http://schemas.openxmlformats.org/drawingml/2006/wordprocessingDrawing" xmlns:r="http://schemas.openxmlformats.org/officeDocument/2006/relationships" xmlns:w14="http://schemas.microsoft.com/office/word/2010/wordml">
       <w:tblPr>
@@ -152,7 +142,7 @@
                 <w:rFonts w:ascii="Calibri" w:hAnsi="Calibri"/>
                 <w:sz w:val="20"/>
               </w:rPr>
-              <w:t xml:space="default">c,d</w:t>
+              <w:t xml:space="default">*</w:t>
             </w:r>
           </w:p>
         </w:tc>
@@ -274,15 +264,6 @@
               </w:rPr>
               <w:t xml:space="default">Green</w:t>
             </w:r>
-            <w:r>
-              <w:rPr>
-                <w:vertAlign w:val="superscript"/>
-                <w:i/>
-                <w:rFonts w:ascii="Calibri" w:hAnsi="Calibri"/>
-                <w:sz w:val="20"/>
-              </w:rPr>
-              <w:t xml:space="default">e</w:t>
-            </w:r>
           </w:p>
         </w:tc>
         <w:tc>
@@ -432,15 +413,6 @@
               </w:rPr>
               <w:t xml:space="default">McMullin</w:t>
             </w:r>
-            <w:r>
-              <w:rPr>
-                <w:vertAlign w:val="superscript"/>
-                <w:i/>
-                <w:rFonts w:ascii="Calibri" w:hAnsi="Calibri"/>
-                <w:sz w:val="20"/>
-              </w:rPr>
-              <w:t xml:space="default">f</w:t>
-            </w:r>
           </w:p>
         </w:tc>
         <w:tc>
@@ -590,15 +562,6 @@
               </w:rPr>
               <w:t xml:space="default">Libertarian</w:t>
             </w:r>
-            <w:r>
-              <w:rPr>
-                <w:vertAlign w:val="superscript"/>
-                <w:i/>
-                <w:rFonts w:ascii="Calibri" w:hAnsi="Calibri"/>
-                <w:sz w:val="20"/>
-              </w:rPr>
-              <w:t xml:space="default">g</w:t>
-            </w:r>
           </w:p>
         </w:tc>
         <w:tc>
@@ -748,15 +711,6 @@
               </w:rPr>
               <w:t xml:space="default">Nader</w:t>
             </w:r>
-            <w:r>
-              <w:rPr>
-                <w:vertAlign w:val="superscript"/>
-                <w:i/>
-                <w:rFonts w:ascii="Calibri" w:hAnsi="Calibri"/>
-                <w:sz w:val="20"/>
-              </w:rPr>
-              <w:t xml:space="default">h</w:t>
-            </w:r>
           </w:p>
         </w:tc>
         <w:tc>
@@ -906,15 +860,6 @@
               </w:rPr>
               <w:t xml:space="default">Green</w:t>
             </w:r>
-            <w:r>
-              <w:rPr>
-                <w:vertAlign w:val="superscript"/>
-                <w:i/>
-                <w:rFonts w:ascii="Calibri" w:hAnsi="Calibri"/>
-                <w:sz w:val="20"/>
-              </w:rPr>
-              <w:t xml:space="default">i</w:t>
-            </w:r>
           </w:p>
         </w:tc>
         <w:tc>
@@ -1064,15 +1009,6 @@
               </w:rPr>
               <w:t xml:space="default">Libertarian</w:t>
             </w:r>
-            <w:r>
-              <w:rPr>
-                <w:vertAlign w:val="superscript"/>
-                <w:i/>
-                <w:rFonts w:ascii="Calibri" w:hAnsi="Calibri"/>
-                <w:sz w:val="20"/>
-              </w:rPr>
-              <w:t xml:space="default">j</w:t>
-            </w:r>
           </w:p>
         </w:tc>
         <w:tc>
@@ -1222,15 +1158,6 @@
               </w:rPr>
               <w:t xml:space="default">Perot</w:t>
             </w:r>
-            <w:r>
-              <w:rPr>
-                <w:vertAlign w:val="superscript"/>
-                <w:i/>
-                <w:rFonts w:ascii="Calibri" w:hAnsi="Calibri"/>
-                <w:sz w:val="20"/>
-              </w:rPr>
-              <w:t xml:space="default">k</w:t>
-            </w:r>
           </w:p>
         </w:tc>
         <w:tc>
@@ -1380,15 +1307,6 @@
               </w:rPr>
               <w:t xml:space="default">Anderson</w:t>
             </w:r>
-            <w:r>
-              <w:rPr>
-                <w:vertAlign w:val="superscript"/>
-                <w:i/>
-                <w:rFonts w:ascii="Calibri" w:hAnsi="Calibri"/>
-                <w:sz w:val="20"/>
-              </w:rPr>
-              <w:t xml:space="default">l</w:t>
-            </w:r>
           </w:p>
         </w:tc>
         <w:tc>
@@ -1538,15 +1456,6 @@
               </w:rPr>
               <w:t xml:space="default">Libertarian</w:t>
             </w:r>
-            <w:r>
-              <w:rPr>
-                <w:vertAlign w:val="superscript"/>
-                <w:i/>
-                <w:rFonts w:ascii="Calibri" w:hAnsi="Calibri"/>
-                <w:sz w:val="20"/>
-              </w:rPr>
-              <w:t xml:space="default">m</w:t>
-            </w:r>
           </w:p>
         </w:tc>
         <w:tc>
@@ -1696,15 +1605,6 @@
               </w:rPr>
               <w:t xml:space="default">McCarthy</w:t>
             </w:r>
-            <w:r>
-              <w:rPr>
-                <w:vertAlign w:val="superscript"/>
-                <w:i/>
-                <w:rFonts w:ascii="Calibri" w:hAnsi="Calibri"/>
-                <w:sz w:val="20"/>
-              </w:rPr>
-              <w:t xml:space="default">n</w:t>
-            </w:r>
           </w:p>
         </w:tc>
         <w:tc>
@@ -1854,15 +1754,6 @@
               </w:rPr>
               <w:t xml:space="default">Independent</w:t>
             </w:r>
-            <w:r>
-              <w:rPr>
-                <w:vertAlign w:val="superscript"/>
-                <w:i/>
-                <w:rFonts w:ascii="Calibri" w:hAnsi="Calibri"/>
-                <w:sz w:val="20"/>
-              </w:rPr>
-              <w:t xml:space="default">o</w:t>
-            </w:r>
           </w:p>
         </w:tc>
         <w:tc>
@@ -2012,15 +1903,6 @@
               </w:rPr>
               <w:t xml:space="default">Thurmond</w:t>
             </w:r>
-            <w:r>
-              <w:rPr>
-                <w:vertAlign w:val="superscript"/>
-                <w:i/>
-                <w:rFonts w:ascii="Calibri" w:hAnsi="Calibri"/>
-                <w:sz w:val="20"/>
-              </w:rPr>
-              <w:t xml:space="default">p</w:t>
-            </w:r>
           </w:p>
         </w:tc>
         <w:tc>
@@ -2170,15 +2052,6 @@
               </w:rPr>
               <w:t xml:space="default">Wallace</w:t>
             </w:r>
-            <w:r>
-              <w:rPr>
-                <w:vertAlign w:val="superscript"/>
-                <w:i/>
-                <w:rFonts w:ascii="Calibri" w:hAnsi="Calibri"/>
-                <w:sz w:val="20"/>
-              </w:rPr>
-              <w:t xml:space="default">q</w:t>
-            </w:r>
           </w:p>
         </w:tc>
         <w:tc>
@@ -2226,15 +2099,6 @@
                 <w:sz w:val="20"/>
               </w:rPr>
               <w:t xml:space="default">1</w:t>
-            </w:r>
-            <w:r>
-              <w:rPr>
-                <w:vertAlign w:val="superscript"/>
-                <w:i/>
-                <w:rFonts w:ascii="Calibri" w:hAnsi="Calibri"/>
-                <w:sz w:val="20"/>
-              </w:rPr>
-              <w:t xml:space="default">r</w:t>
             </w:r>
           </w:p>
         </w:tc>
@@ -2307,71 +2171,7 @@
                 <w:rFonts w:ascii="Calibri" w:hAnsi="Calibri"/>
                 <w:sz w:val="20"/>
               </w:rPr>
-              <w:t xml:space="default">a</w:t>
-            </w:r>
-            <w:r>
-              <w:rPr>
-                <w:rFonts w:ascii="Calibri" w:hAnsi="Calibri"/>
-                <w:sz w:val="20"/>
-              </w:rPr>
-              <w:t xml:space="default">Each election year’s major party platforms were sourced from the American Presidency Project. 'Party Platforms | The American Presidency Project,' accessed August 8, 2025, https://www.presidency.ucsb.edu/documents/app-categories/elections-and-transitions/party-platforms.</w:t>
-            </w:r>
-          </w:p>
-        </w:tc>
-      </w:tr>
-      <w:tr>
-        <w:trPr>
-          <w:cantSplit/>
-        </w:trPr>
-        <w:tc>
-          <w:tcPr>
-            <w:gridSpan w:val="6"/>
-          </w:tcPr>
-          <w:p>
-            <w:pPr>
-              <w:spacing w:before="0" w:after="60"/>
-              <w:keepNext/>
-            </w:pPr>
-            <w:r>
-              <w:rPr>
-                <w:vertAlign w:val="superscript"/>
-                <w:i/>
-                <w:rFonts w:ascii="Calibri" w:hAnsi="Calibri"/>
-                <w:sz w:val="20"/>
-              </w:rPr>
-              <w:t xml:space="default">b</w:t>
-            </w:r>
-            <w:r>
-              <w:rPr>
-                <w:rFonts w:ascii="Calibri" w:hAnsi="Calibri"/>
-                <w:sz w:val="20"/>
-              </w:rPr>
-              <w:t xml:space="default">Some independent candidates, such as Evan McMullin, did not have a formal platform; therefore, this study used an alternative document that intended to outline the campaign’s positions on a wide range of issues.</w:t>
-            </w:r>
-          </w:p>
-        </w:tc>
-      </w:tr>
-      <w:tr>
-        <w:trPr>
-          <w:cantSplit/>
-        </w:trPr>
-        <w:tc>
-          <w:tcPr>
-            <w:gridSpan w:val="6"/>
-          </w:tcPr>
-          <w:p>
-            <w:pPr>
-              <w:spacing w:before="0" w:after="60"/>
-              <w:keepNext/>
-            </w:pPr>
-            <w:r>
-              <w:rPr>
-                <w:vertAlign w:val="superscript"/>
-                <w:i/>
-                <w:rFonts w:ascii="Calibri" w:hAnsi="Calibri"/>
-                <w:sz w:val="20"/>
-              </w:rPr>
-              <w:t xml:space="default">c</w:t>
+              <w:t xml:space="default">*</w:t>
             </w:r>
             <w:r>
               <w:rPr>
@@ -2379,486 +2179,6 @@
                 <w:sz w:val="20"/>
               </w:rPr>
               <w:t xml:space="default">Vote share is measured in percentage points.</w:t>
-            </w:r>
-          </w:p>
-        </w:tc>
-      </w:tr>
-      <w:tr>
-        <w:trPr>
-          <w:cantSplit/>
-        </w:trPr>
-        <w:tc>
-          <w:tcPr>
-            <w:gridSpan w:val="6"/>
-          </w:tcPr>
-          <w:p>
-            <w:pPr>
-              <w:spacing w:before="0" w:after="60"/>
-              <w:keepNext/>
-            </w:pPr>
-            <w:r>
-              <w:rPr>
-                <w:vertAlign w:val="superscript"/>
-                <w:i/>
-                <w:rFonts w:ascii="Calibri" w:hAnsi="Calibri"/>
-                <w:sz w:val="20"/>
-              </w:rPr>
-              <w:t xml:space="default">d</w:t>
-            </w:r>
-            <w:r>
-              <w:rPr>
-                <w:rFonts w:ascii="Calibri" w:hAnsi="Calibri"/>
-                <w:sz w:val="20"/>
-              </w:rPr>
-              <w:t xml:space="default">Vote share and seats won were sourced from the official FEC Federal Election Results packets for elections after 1976 and entries in Dave Leip's Atlas of U.S. Presidential Elections for elections before that date. 'Election Results and Voting Information,' FEC.Gov, accessed August 8, 2025, https://www.fec.gov/introduction-campaign-finance/election-results-and-voting-information/. Dave Leip, 'Dave Leip’s Atlas of U.S. Presidential Elections,' accessed August 8, 2025, https://uselectionatlas.org/.</w:t>
-            </w:r>
-          </w:p>
-        </w:tc>
-      </w:tr>
-      <w:tr>
-        <w:trPr>
-          <w:cantSplit/>
-        </w:trPr>
-        <w:tc>
-          <w:tcPr>
-            <w:gridSpan w:val="6"/>
-          </w:tcPr>
-          <w:p>
-            <w:pPr>
-              <w:spacing w:before="0" w:after="60"/>
-              <w:keepNext/>
-            </w:pPr>
-            <w:r>
-              <w:rPr>
-                <w:vertAlign w:val="superscript"/>
-                <w:i/>
-                <w:rFonts w:ascii="Calibri" w:hAnsi="Calibri"/>
-                <w:sz w:val="20"/>
-              </w:rPr>
-              <w:t xml:space="default">e</w:t>
-            </w:r>
-            <w:r>
-              <w:rPr>
-                <w:rFonts w:ascii="Calibri" w:hAnsi="Calibri"/>
-                <w:sz w:val="20"/>
-              </w:rPr>
-              <w:t xml:space="default">'2016 Green Party Platform.Pdf,' Ballotpedia, April 2020, https://ballotpedia.org/File:2016_Green_Party_Platform.pdf.</w:t>
-            </w:r>
-          </w:p>
-        </w:tc>
-      </w:tr>
-      <w:tr>
-        <w:trPr>
-          <w:cantSplit/>
-        </w:trPr>
-        <w:tc>
-          <w:tcPr>
-            <w:gridSpan w:val="6"/>
-          </w:tcPr>
-          <w:p>
-            <w:pPr>
-              <w:spacing w:before="0" w:after="60"/>
-              <w:keepNext/>
-            </w:pPr>
-            <w:r>
-              <w:rPr>
-                <w:vertAlign w:val="superscript"/>
-                <w:i/>
-                <w:rFonts w:ascii="Calibri" w:hAnsi="Calibri"/>
-                <w:sz w:val="20"/>
-              </w:rPr>
-              <w:t xml:space="default">f</w:t>
-            </w:r>
-            <w:r>
-              <w:rPr>
-                <w:rFonts w:ascii="Calibri" w:hAnsi="Calibri"/>
-                <w:sz w:val="20"/>
-              </w:rPr>
-              <w:t xml:space="default">'On The Issues,' Evan McMullin for President, 2016, https://web.archive.org/web/20161107080610/https://www.evanmcmullin.com/issues.</w:t>
-            </w:r>
-          </w:p>
-        </w:tc>
-      </w:tr>
-      <w:tr>
-        <w:trPr>
-          <w:cantSplit/>
-        </w:trPr>
-        <w:tc>
-          <w:tcPr>
-            <w:gridSpan w:val="6"/>
-          </w:tcPr>
-          <w:p>
-            <w:pPr>
-              <w:spacing w:before="0" w:after="60"/>
-              <w:keepNext/>
-            </w:pPr>
-            <w:r>
-              <w:rPr>
-                <w:vertAlign w:val="superscript"/>
-                <w:i/>
-                <w:rFonts w:ascii="Calibri" w:hAnsi="Calibri"/>
-                <w:sz w:val="20"/>
-              </w:rPr>
-              <w:t xml:space="default">g</w:t>
-            </w:r>
-            <w:r>
-              <w:rPr>
-                <w:rFonts w:ascii="Calibri" w:hAnsi="Calibri"/>
-                <w:sz w:val="20"/>
-              </w:rPr>
-              <w:t xml:space="default">'National Platform 2016,' LPedia, May 2016, https://lpedia.org/wiki/Document:National_Platform_2016.</w:t>
-            </w:r>
-          </w:p>
-        </w:tc>
-      </w:tr>
-      <w:tr>
-        <w:trPr>
-          <w:cantSplit/>
-        </w:trPr>
-        <w:tc>
-          <w:tcPr>
-            <w:gridSpan w:val="6"/>
-          </w:tcPr>
-          <w:p>
-            <w:pPr>
-              <w:spacing w:before="0" w:after="60"/>
-              <w:keepNext/>
-            </w:pPr>
-            <w:r>
-              <w:rPr>
-                <w:vertAlign w:val="superscript"/>
-                <w:i/>
-                <w:rFonts w:ascii="Calibri" w:hAnsi="Calibri"/>
-                <w:sz w:val="20"/>
-              </w:rPr>
-              <w:t xml:space="default">h</w:t>
-            </w:r>
-            <w:r>
-              <w:rPr>
-                <w:rFonts w:ascii="Calibri" w:hAnsi="Calibri"/>
-                <w:sz w:val="20"/>
-              </w:rPr>
-              <w:t xml:space="default">'Political Issues That Matter,' Vote Nader, 2008, https://www.votenader.org/issues/.</w:t>
-            </w:r>
-          </w:p>
-        </w:tc>
-      </w:tr>
-      <w:tr>
-        <w:trPr>
-          <w:cantSplit/>
-        </w:trPr>
-        <w:tc>
-          <w:tcPr>
-            <w:gridSpan w:val="6"/>
-          </w:tcPr>
-          <w:p>
-            <w:pPr>
-              <w:spacing w:before="0" w:after="60"/>
-              <w:keepNext/>
-            </w:pPr>
-            <w:r>
-              <w:rPr>
-                <w:vertAlign w:val="superscript"/>
-                <w:i/>
-                <w:rFonts w:ascii="Calibri" w:hAnsi="Calibri"/>
-                <w:sz w:val="20"/>
-              </w:rPr>
-              <w:t xml:space="default">i</w:t>
-            </w:r>
-            <w:r>
-              <w:rPr>
-                <w:rFonts w:ascii="Calibri" w:hAnsi="Calibri"/>
-                <w:sz w:val="20"/>
-              </w:rPr>
-              <w:t xml:space="default">'2000 Platform,' *Green Party of the United States*, n.d., accessed August 8, 2025, https://gpus.org/committees/platform/2000-platform/.</w:t>
-            </w:r>
-          </w:p>
-        </w:tc>
-      </w:tr>
-      <w:tr>
-        <w:trPr>
-          <w:cantSplit/>
-        </w:trPr>
-        <w:tc>
-          <w:tcPr>
-            <w:gridSpan w:val="6"/>
-          </w:tcPr>
-          <w:p>
-            <w:pPr>
-              <w:spacing w:before="0" w:after="60"/>
-              <w:keepNext/>
-            </w:pPr>
-            <w:r>
-              <w:rPr>
-                <w:vertAlign w:val="superscript"/>
-                <w:i/>
-                <w:rFonts w:ascii="Calibri" w:hAnsi="Calibri"/>
-                <w:sz w:val="20"/>
-              </w:rPr>
-              <w:t xml:space="default">j</w:t>
-            </w:r>
-            <w:r>
-              <w:rPr>
-                <w:rFonts w:ascii="Calibri" w:hAnsi="Calibri"/>
-                <w:sz w:val="20"/>
-              </w:rPr>
-              <w:t xml:space="default">'National Platform 1996,' July 1996, https://lpedia.org/wiki/Document:National_Platform_1996.</w:t>
-            </w:r>
-          </w:p>
-        </w:tc>
-      </w:tr>
-      <w:tr>
-        <w:trPr>
-          <w:cantSplit/>
-        </w:trPr>
-        <w:tc>
-          <w:tcPr>
-            <w:gridSpan w:val="6"/>
-          </w:tcPr>
-          <w:p>
-            <w:pPr>
-              <w:spacing w:before="0" w:after="60"/>
-              <w:keepNext/>
-            </w:pPr>
-            <w:r>
-              <w:rPr>
-                <w:vertAlign w:val="superscript"/>
-                <w:i/>
-                <w:rFonts w:ascii="Calibri" w:hAnsi="Calibri"/>
-                <w:sz w:val="20"/>
-              </w:rPr>
-              <w:t xml:space="default">k</w:t>
-            </w:r>
-            <w:r>
-              <w:rPr>
-                <w:rFonts w:ascii="Calibri" w:hAnsi="Calibri"/>
-                <w:sz w:val="20"/>
-              </w:rPr>
-              <w:t xml:space="default">Perot, *United We Stand*.</w:t>
-            </w:r>
-          </w:p>
-        </w:tc>
-      </w:tr>
-      <w:tr>
-        <w:trPr>
-          <w:cantSplit/>
-        </w:trPr>
-        <w:tc>
-          <w:tcPr>
-            <w:gridSpan w:val="6"/>
-          </w:tcPr>
-          <w:p>
-            <w:pPr>
-              <w:spacing w:before="0" w:after="60"/>
-              <w:keepNext/>
-            </w:pPr>
-            <w:r>
-              <w:rPr>
-                <w:vertAlign w:val="superscript"/>
-                <w:i/>
-                <w:rFonts w:ascii="Calibri" w:hAnsi="Calibri"/>
-                <w:sz w:val="20"/>
-              </w:rPr>
-              <w:t xml:space="default">l</w:t>
-            </w:r>
-            <w:r>
-              <w:rPr>
-                <w:rFonts w:ascii="Calibri" w:hAnsi="Calibri"/>
-                <w:sz w:val="20"/>
-              </w:rPr>
-              <w:t xml:space="default">The Anderson campaign released two platforms in 1980: 'Rebuilding a Society That Works: An Agenda for America' and 'The Program of the Anderson/Lucey National Unity Campaign.' This study uses the former because it is the document designed to be 'relatively short and deliberately selective.' This quality is likely to make the agenda more revealing of the campaign’s priorities than the more comprehensive program because its space constraint almost certainly forced Anderson to prioritize what issues he covered and at what length. Clifford W. Brown Jr and Robert J. Walker, *A Campaign of Ideas: The 1980 Anderson/Lucey Platform* (Praeger, 1984).</w:t>
-            </w:r>
-          </w:p>
-        </w:tc>
-      </w:tr>
-      <w:tr>
-        <w:trPr>
-          <w:cantSplit/>
-        </w:trPr>
-        <w:tc>
-          <w:tcPr>
-            <w:gridSpan w:val="6"/>
-          </w:tcPr>
-          <w:p>
-            <w:pPr>
-              <w:spacing w:before="0" w:after="60"/>
-              <w:keepNext/>
-            </w:pPr>
-            <w:r>
-              <w:rPr>
-                <w:vertAlign w:val="superscript"/>
-                <w:i/>
-                <w:rFonts w:ascii="Calibri" w:hAnsi="Calibri"/>
-                <w:sz w:val="20"/>
-              </w:rPr>
-              <w:t xml:space="default">m</w:t>
-            </w:r>
-            <w:r>
-              <w:rPr>
-                <w:rFonts w:ascii="Calibri" w:hAnsi="Calibri"/>
-                <w:sz w:val="20"/>
-              </w:rPr>
-              <w:t xml:space="default">'National Platform 1980,' LPedia, 1980, https://lpedia.org/wiki/Document:National_Platform_1980</w:t>
-            </w:r>
-          </w:p>
-        </w:tc>
-      </w:tr>
-      <w:tr>
-        <w:trPr>
-          <w:cantSplit/>
-        </w:trPr>
-        <w:tc>
-          <w:tcPr>
-            <w:gridSpan w:val="6"/>
-          </w:tcPr>
-          <w:p>
-            <w:pPr>
-              <w:spacing w:before="0" w:after="60"/>
-              <w:keepNext/>
-            </w:pPr>
-            <w:r>
-              <w:rPr>
-                <w:vertAlign w:val="superscript"/>
-                <w:i/>
-                <w:rFonts w:ascii="Calibri" w:hAnsi="Calibri"/>
-                <w:sz w:val="20"/>
-              </w:rPr>
-              <w:t xml:space="default">n</w:t>
-            </w:r>
-            <w:r>
-              <w:rPr>
-                <w:rFonts w:ascii="Calibri" w:hAnsi="Calibri"/>
-                <w:sz w:val="20"/>
-              </w:rPr>
-              <w:t xml:space="default">'The Spirit of Independence,' 1976.</w:t>
-            </w:r>
-          </w:p>
-        </w:tc>
-      </w:tr>
-      <w:tr>
-        <w:trPr>
-          <w:cantSplit/>
-        </w:trPr>
-        <w:tc>
-          <w:tcPr>
-            <w:gridSpan w:val="6"/>
-          </w:tcPr>
-          <w:p>
-            <w:pPr>
-              <w:spacing w:before="0" w:after="60"/>
-              <w:keepNext/>
-            </w:pPr>
-            <w:r>
-              <w:rPr>
-                <w:vertAlign w:val="superscript"/>
-                <w:i/>
-                <w:rFonts w:ascii="Calibri" w:hAnsi="Calibri"/>
-                <w:sz w:val="20"/>
-              </w:rPr>
-              <w:t xml:space="default">o</w:t>
-            </w:r>
-            <w:r>
-              <w:rPr>
-                <w:rFonts w:ascii="Calibri" w:hAnsi="Calibri"/>
-                <w:sz w:val="20"/>
-              </w:rPr>
-              <w:t xml:space="default">'American Independent Party Platform of 1968,' October 13, 1968, https://www.presidency.ucsb.edu/documents/american-independent-party-platform-1968.</w:t>
-            </w:r>
-          </w:p>
-        </w:tc>
-      </w:tr>
-      <w:tr>
-        <w:trPr>
-          <w:cantSplit/>
-        </w:trPr>
-        <w:tc>
-          <w:tcPr>
-            <w:gridSpan w:val="6"/>
-          </w:tcPr>
-          <w:p>
-            <w:pPr>
-              <w:spacing w:before="0" w:after="60"/>
-              <w:keepNext/>
-            </w:pPr>
-            <w:r>
-              <w:rPr>
-                <w:vertAlign w:val="superscript"/>
-                <w:i/>
-                <w:rFonts w:ascii="Calibri" w:hAnsi="Calibri"/>
-                <w:sz w:val="20"/>
-              </w:rPr>
-              <w:t xml:space="default">p</w:t>
-            </w:r>
-            <w:r>
-              <w:rPr>
-                <w:rFonts w:ascii="Calibri" w:hAnsi="Calibri"/>
-                <w:sz w:val="20"/>
-              </w:rPr>
-              <w:t xml:space="default">'Platform of the States Rights Democratic Party,' The American Presidency Project, August 14, 1948, https://www.presidency.ucsb.edu/documents/platform-the-states-rights-democratic-party.</w:t>
-            </w:r>
-          </w:p>
-        </w:tc>
-      </w:tr>
-      <w:tr>
-        <w:trPr>
-          <w:cantSplit/>
-        </w:trPr>
-        <w:tc>
-          <w:tcPr>
-            <w:gridSpan w:val="6"/>
-          </w:tcPr>
-          <w:p>
-            <w:pPr>
-              <w:spacing w:before="0" w:after="60"/>
-              <w:keepNext/>
-            </w:pPr>
-            <w:r>
-              <w:rPr>
-                <w:vertAlign w:val="superscript"/>
-                <w:i/>
-                <w:rFonts w:ascii="Calibri" w:hAnsi="Calibri"/>
-                <w:sz w:val="20"/>
-              </w:rPr>
-              <w:t xml:space="default">q</w:t>
-            </w:r>
-            <w:r>
-              <w:rPr>
-                <w:rFonts w:ascii="Calibri" w:hAnsi="Calibri"/>
-                <w:sz w:val="20"/>
-              </w:rPr>
-              <w:t xml:space="default">'Progressive Party Platform of 1948,' The American Presidency Project, July 23, 1948, https://www.presidency.ucsb.edu/documents/progressive-party-platform-1948.</w:t>
-            </w:r>
-          </w:p>
-        </w:tc>
-      </w:tr>
-      <w:tr>
-        <w:trPr>
-          <w:cantSplit/>
-        </w:trPr>
-        <w:tc>
-          <w:tcPr>
-            <w:gridSpan w:val="6"/>
-          </w:tcPr>
-          <w:p>
-            <w:pPr>
-              <w:spacing w:before="0" w:after="60"/>
-              <w:keepNext/>
-            </w:pPr>
-            <w:r>
-              <w:rPr>
-                <w:vertAlign w:val="superscript"/>
-                <w:i/>
-                <w:rFonts w:ascii="Calibri" w:hAnsi="Calibri"/>
-                <w:sz w:val="20"/>
-              </w:rPr>
-              <w:t xml:space="default">r</w:t>
-            </w:r>
-            <w:r>
-              <w:rPr>
-                <w:rFonts w:ascii="Calibri" w:hAnsi="Calibri"/>
-                <w:sz w:val="20"/>
-              </w:rPr>
-              <w:t xml:space="default">Leo Isacson won a special election in 1948 after receiving Henry Wallace’s endorsement. He was, however, elected as a member of the American Labor Party. He is counted here due to the considerable overlap between labor movements in the 1940s, but removing him from the Progressive party’s total will not change the eventual conclusion that the number of legislative seats a party wins is wholly uncorrelated with more robust measures of minor party success. In fact, removing Isacson will lower the correlation coefficient, by definition, given the lack of any other Congresspeople representing minor parties listed here, to 0.</w:t>
             </w:r>
           </w:p>
         </w:tc>

</xml_diff>